<commit_message>
se actualiza la documentación técnica para reflejar la ventana de gracia semanal, se ajusta RF-13, el flujo alternativo C del caso de uso CU-01 y se agrega párrafo en la sección de mejoras implementadas
Co-Authored-By: Claude Sonnet 4.6 <noreply@anthropic.com>
</commit_message>
<xml_diff>
--- a/docs/documentacion_tecnica.docx
+++ b/docs/documentacion_tecnica.docx
@@ -9702,7 +9702,7 @@
                 <w:rFonts w:ascii="Arial Narrow" w:hAnsi="Arial Narrow"/>
                 <w:sz w:val="20"/>
               </w:rPr>
-              <w:t>Verificar que el beneficiario no tenga solicitud activa en el período vigente</w:t>
+              <w:t>Verificar que el beneficiario no tenga solicitud activa en los últimos 30 días; con ventana de gracia semanal: si el vencimiento de los 30 días cae entre el lunes y el jueves de la semana en curso, se adelanta el permiso al inicio de esa semana para incluir la solicitud en la preparación del lunes</w:t>
             </w:r>
           </w:p>
         </w:tc>
@@ -12945,7 +12945,7 @@
                 <w:b w:val="0"/>
                 <w:sz w:val="20"/>
               </w:rPr>
-              <w:t>Si el empleado ya realizó una solicitud en el período vigente: el sistema muestra la solicitud activa existente e impide registrar una nueva</w:t>
+              <w:t>Si el empleado ya realizó una solicitud en los últimos 30 días y no se encuentra en ventana de gracia semanal: el sistema muestra la solicitud activa existente e impide registrar una nueva. Excepción: si el vencimiento de los 30 días cae entre el lunes y el jueves de la semana en curso, el sistema permite adelantar la solicitud sin mostrar bloqueo</w:t>
             </w:r>
           </w:p>
         </w:tc>
@@ -29136,6 +29136,22 @@
           <w:sz w:val="22"/>
         </w:rPr>
         <w:t>Se optimizó el intervalo de actualización (heartbeat) del dashboard y del listado de solicitudes de 5 a 10 segundos, reduciendo la carga de peticiones al servidor sin afectar la percepción de actualización en tiempo real. Se reforzó la validación del campo documento en la actualización de beneficiarios para impedir la asignación de un número de documento ya existente en otro registro. La lógica de importación masiva desde Excel fue actualizada para incluir en el mensaje de resultado el conteo de registros omitidos por estar previamente dados de baja, mejorando la trazabilidad del proceso de importación. Finalmente, se mejoró la gestión de sesión en el middleware de autenticación, incorporando redirección diferenciada para solicitudes AJAX (respuesta JSON con código 401) frente a peticiones de página completa (redirección HTTP al login), evitando respuestas HTML inesperadas en llamadas asíncronas.</w:t>
+      </w:r>
+    </w:p>
+    <w:p>
+      <w:pPr>
+        <w:spacing w:before="0" w:after="120" w:lineRule="auto" w:line="360"/>
+        <w:ind w:firstLine="720"/>
+        <w:jc w:val="both"/>
+      </w:pPr>
+      <w:r>
+        <w:rPr>
+          <w:rFonts w:ascii="Arial Narrow" w:hAnsi="Arial Narrow"/>
+          <w:b w:val="0"/>
+          <w:i w:val="0"/>
+          <w:sz w:val="22"/>
+        </w:rPr>
+        <w:t>Se implementó una ventana de gracia semanal en la validación de período por beneficiario. Dado que la empresa prepara y entrega los ramos los días lunes, los beneficiarios cuyo vencimiento de los 30 días caiga entre el lunes y el jueves de la semana en curso pueden adelantar su solicitud al inicio de esa semana, sin necesidad de esperar al día exacto de vencimiento. La regla permite incluir la solicitud en la preparación del lunes y evita que el beneficiario pierda un ciclo completo de entrega por diferencias de uno a tres días en su calendario de elegibilidad. La lógica se implementó en el método enVentanaGracia() del modelo Solicitud, que es invocado tanto por tieneSolicitudEnPeriodo() como por getSolicitudActivaEnPeriodo(), garantizando coherencia entre la verificación de creación y la validación en el panel de autoatención.</w:t>
       </w:r>
     </w:p>
     <w:p>

</xml_diff>

<commit_message>
se agrega el acceso directo Petalo con icono, se cambia iniciar.bat para levantar el servidor PHP integrado y se documentan RF-24 y RF-25 en la documentacion tecnica
Co-authored-by: Cursor <cursoragent@cursor.com>
</commit_message>
<xml_diff>
--- a/docs/documentacion_tecnica.docx
+++ b/docs/documentacion_tecnica.docx
@@ -11027,6 +11027,260 @@
           </w:p>
         </w:tc>
       </w:tr>
+      <w:tr>
+        <w:tc>
+          <w:tcPr>
+            <w:tcW w:type="dxa" w:w="1872"/>
+            <w:tcBorders>
+              <w:top w:val="none"/>
+              <w:left w:val="none"/>
+              <w:bottom w:val="none"/>
+              <w:right w:val="none"/>
+              <w:insideH w:val="none"/>
+              <w:insideV w:val="none"/>
+            </w:tcBorders>
+          </w:tcPr>
+          <w:p>
+            <w:pPr>
+              <w:jc w:val="left"/>
+            </w:pPr>
+            <w:r>
+              <w:rPr>
+                <w:rFonts w:ascii="Arial Narrow" w:hAnsi="Arial Narrow"/>
+                <w:sz w:val="20"/>
+              </w:rPr>
+              <w:t>RF-24</w:t>
+            </w:r>
+          </w:p>
+        </w:tc>
+        <w:tc>
+          <w:tcPr>
+            <w:tcW w:type="dxa" w:w="1872"/>
+            <w:tcBorders>
+              <w:top w:val="none"/>
+              <w:left w:val="none"/>
+              <w:bottom w:val="none"/>
+              <w:right w:val="none"/>
+              <w:insideH w:val="none"/>
+              <w:insideV w:val="none"/>
+            </w:tcBorders>
+          </w:tcPr>
+          <w:p>
+            <w:pPr>
+              <w:jc w:val="left"/>
+            </w:pPr>
+            <w:r>
+              <w:rPr>
+                <w:rFonts w:ascii="Arial Narrow" w:hAnsi="Arial Narrow"/>
+                <w:sz w:val="20"/>
+              </w:rPr>
+              <w:t>Bloqueo de solicitudes para beneficiarios inactivos</w:t>
+            </w:r>
+          </w:p>
+        </w:tc>
+        <w:tc>
+          <w:tcPr>
+            <w:tcW w:type="dxa" w:w="1872"/>
+            <w:tcBorders>
+              <w:top w:val="none"/>
+              <w:left w:val="none"/>
+              <w:bottom w:val="none"/>
+              <w:right w:val="none"/>
+              <w:insideH w:val="none"/>
+              <w:insideV w:val="none"/>
+            </w:tcBorders>
+          </w:tcPr>
+          <w:p>
+            <w:pPr>
+              <w:jc w:val="left"/>
+            </w:pPr>
+            <w:r>
+              <w:rPr>
+                <w:rFonts w:ascii="Arial Narrow" w:hAnsi="Arial Narrow"/>
+                <w:sz w:val="20"/>
+              </w:rPr>
+              <w:t>Al buscar un beneficiario por documento, si este se encuentra en estado inactivo el sistema impide la creación de la solicitud y muestra un mensaje de error específico, sin ofrecer la opción de registrar una nueva persona con ese documento</w:t>
+            </w:r>
+          </w:p>
+        </w:tc>
+        <w:tc>
+          <w:tcPr>
+            <w:tcW w:type="dxa" w:w="1872"/>
+            <w:tcBorders>
+              <w:top w:val="none"/>
+              <w:left w:val="none"/>
+              <w:bottom w:val="none"/>
+              <w:right w:val="none"/>
+              <w:insideH w:val="none"/>
+              <w:insideV w:val="none"/>
+            </w:tcBorders>
+          </w:tcPr>
+          <w:p>
+            <w:pPr>
+              <w:jc w:val="left"/>
+            </w:pPr>
+            <w:r>
+              <w:rPr>
+                <w:rFonts w:ascii="Arial Narrow" w:hAnsi="Arial Narrow"/>
+                <w:sz w:val="20"/>
+              </w:rPr>
+              <w:t>Solicitudes</w:t>
+            </w:r>
+          </w:p>
+        </w:tc>
+        <w:tc>
+          <w:tcPr>
+            <w:tcW w:type="dxa" w:w="1872"/>
+            <w:tcBorders>
+              <w:top w:val="none"/>
+              <w:left w:val="none"/>
+              <w:bottom w:val="none"/>
+              <w:right w:val="none"/>
+              <w:insideH w:val="none"/>
+              <w:insideV w:val="none"/>
+            </w:tcBorders>
+          </w:tcPr>
+          <w:p>
+            <w:pPr>
+              <w:jc w:val="left"/>
+            </w:pPr>
+            <w:r>
+              <w:rPr>
+                <w:rFonts w:ascii="Arial Narrow" w:hAnsi="Arial Narrow"/>
+                <w:sz w:val="20"/>
+              </w:rPr>
+              <w:t>Alta</w:t>
+            </w:r>
+          </w:p>
+        </w:tc>
+      </w:tr>
+      <w:tr>
+        <w:tc>
+          <w:tcPr>
+            <w:tcW w:type="dxa" w:w="1872"/>
+            <w:tcBorders>
+              <w:top w:val="none"/>
+              <w:left w:val="none"/>
+              <w:bottom w:val="none"/>
+              <w:right w:val="none"/>
+              <w:insideH w:val="none"/>
+              <w:insideV w:val="none"/>
+            </w:tcBorders>
+          </w:tcPr>
+          <w:p>
+            <w:pPr>
+              <w:jc w:val="left"/>
+            </w:pPr>
+            <w:r>
+              <w:rPr>
+                <w:rFonts w:ascii="Arial Narrow" w:hAnsi="Arial Narrow"/>
+                <w:sz w:val="20"/>
+              </w:rPr>
+              <w:t>RF-25</w:t>
+            </w:r>
+          </w:p>
+        </w:tc>
+        <w:tc>
+          <w:tcPr>
+            <w:tcW w:type="dxa" w:w="1872"/>
+            <w:tcBorders>
+              <w:top w:val="none"/>
+              <w:left w:val="none"/>
+              <w:bottom w:val="none"/>
+              <w:right w:val="none"/>
+              <w:insideH w:val="none"/>
+              <w:insideV w:val="none"/>
+            </w:tcBorders>
+          </w:tcPr>
+          <w:p>
+            <w:pPr>
+              <w:jc w:val="left"/>
+            </w:pPr>
+            <w:r>
+              <w:rPr>
+                <w:rFonts w:ascii="Arial Narrow" w:hAnsi="Arial Narrow"/>
+                <w:sz w:val="20"/>
+              </w:rPr>
+              <w:t>Gestión de contraseña exclusiva del administrador</w:t>
+            </w:r>
+          </w:p>
+        </w:tc>
+        <w:tc>
+          <w:tcPr>
+            <w:tcW w:type="dxa" w:w="1872"/>
+            <w:tcBorders>
+              <w:top w:val="none"/>
+              <w:left w:val="none"/>
+              <w:bottom w:val="none"/>
+              <w:right w:val="none"/>
+              <w:insideH w:val="none"/>
+              <w:insideV w:val="none"/>
+            </w:tcBorders>
+          </w:tcPr>
+          <w:p>
+            <w:pPr>
+              <w:jc w:val="left"/>
+            </w:pPr>
+            <w:r>
+              <w:rPr>
+                <w:rFonts w:ascii="Arial Narrow" w:hAnsi="Arial Narrow"/>
+                <w:sz w:val="20"/>
+              </w:rPr>
+              <w:t>El cambio de contraseña de los usuarios del sistema es una operación restringida al rol administrador; el operador no dispone de esta opción en su interfaz ni puede acceder al endpoint correspondiente</w:t>
+            </w:r>
+          </w:p>
+        </w:tc>
+        <w:tc>
+          <w:tcPr>
+            <w:tcW w:type="dxa" w:w="1872"/>
+            <w:tcBorders>
+              <w:top w:val="none"/>
+              <w:left w:val="none"/>
+              <w:bottom w:val="none"/>
+              <w:right w:val="none"/>
+              <w:insideH w:val="none"/>
+              <w:insideV w:val="none"/>
+            </w:tcBorders>
+          </w:tcPr>
+          <w:p>
+            <w:pPr>
+              <w:jc w:val="left"/>
+            </w:pPr>
+            <w:r>
+              <w:rPr>
+                <w:rFonts w:ascii="Arial Narrow" w:hAnsi="Arial Narrow"/>
+                <w:sz w:val="20"/>
+              </w:rPr>
+              <w:t>Autenticación</w:t>
+            </w:r>
+          </w:p>
+        </w:tc>
+        <w:tc>
+          <w:tcPr>
+            <w:tcW w:type="dxa" w:w="1872"/>
+            <w:tcBorders>
+              <w:top w:val="none"/>
+              <w:left w:val="none"/>
+              <w:bottom w:val="none"/>
+              <w:right w:val="none"/>
+              <w:insideH w:val="none"/>
+              <w:insideV w:val="none"/>
+            </w:tcBorders>
+          </w:tcPr>
+          <w:p>
+            <w:pPr>
+              <w:jc w:val="left"/>
+            </w:pPr>
+            <w:r>
+              <w:rPr>
+                <w:rFonts w:ascii="Arial Narrow" w:hAnsi="Arial Narrow"/>
+                <w:sz w:val="20"/>
+              </w:rPr>
+              <w:t>Alta</w:t>
+            </w:r>
+          </w:p>
+        </w:tc>
+      </w:tr>
     </w:tbl>
     <w:p>
       <w:pPr>
@@ -12974,6 +13228,61 @@
                 <w:b/>
                 <w:sz w:val="20"/>
               </w:rPr>
+              <w:t>Flujo alternativo D</w:t>
+            </w:r>
+          </w:p>
+        </w:tc>
+        <w:tc>
+          <w:tcPr>
+            <w:tcW w:type="dxa" w:w="4680"/>
+            <w:tcBorders>
+              <w:top w:val="none"/>
+              <w:left w:val="none"/>
+              <w:bottom w:val="none"/>
+              <w:right w:val="none"/>
+              <w:insideH w:val="none"/>
+              <w:insideV w:val="none"/>
+            </w:tcBorders>
+          </w:tcPr>
+          <w:p>
+            <w:pPr>
+              <w:jc w:val="left"/>
+            </w:pPr>
+            <w:r>
+              <w:rPr>
+                <w:rFonts w:ascii="Arial Narrow" w:hAnsi="Arial Narrow"/>
+                <w:b w:val="0"/>
+                <w:sz w:val="20"/>
+              </w:rPr>
+              <w:t>Si el beneficiario existe en el sistema pero se encuentra en estado inactivo: el sistema muestra un mensaje de error específico e impide tanto la creación de la solicitud como la oferta de registrar una nueva persona con ese documento</w:t>
+            </w:r>
+          </w:p>
+        </w:tc>
+      </w:tr>
+      <w:tr>
+        <w:tc>
+          <w:tcPr>
+            <w:tcW w:type="dxa" w:w="4680"/>
+            <w:shd w:val="clear" w:color="auto" w:fill="F0F0F0"/>
+            <w:tcBorders>
+              <w:top w:val="none"/>
+              <w:left w:val="none"/>
+              <w:bottom w:val="none"/>
+              <w:right w:val="none"/>
+              <w:insideH w:val="none"/>
+              <w:insideV w:val="none"/>
+            </w:tcBorders>
+          </w:tcPr>
+          <w:p>
+            <w:pPr>
+              <w:jc w:val="left"/>
+            </w:pPr>
+            <w:r>
+              <w:rPr>
+                <w:rFonts w:ascii="Arial Narrow" w:hAnsi="Arial Narrow"/>
+                <w:b/>
+                <w:sz w:val="20"/>
+              </w:rPr>
               <w:t>Postcondición</w:t>
             </w:r>
           </w:p>
@@ -29152,6 +29461,38 @@
           <w:sz w:val="22"/>
         </w:rPr>
         <w:t>Se implementó una ventana de gracia semanal en la validación de período por beneficiario. Dado que la empresa prepara y entrega los ramos los días lunes, los beneficiarios cuyo vencimiento de los 30 días caiga entre el lunes y el jueves de la semana en curso pueden adelantar su solicitud al inicio de esa semana, sin necesidad de esperar al día exacto de vencimiento. La regla permite incluir la solicitud en la preparación del lunes y evita que el beneficiario pierda un ciclo completo de entrega por diferencias de uno a tres días en su calendario de elegibilidad. La lógica se implementó en el método enVentanaGracia() del modelo Solicitud, que es invocado tanto por tieneSolicitudEnPeriodo() como por getSolicitudActivaEnPeriodo(), garantizando coherencia entre la verificación de creación y la validación en el panel de autoatención.</w:t>
+      </w:r>
+    </w:p>
+    <w:p>
+      <w:pPr>
+        <w:spacing w:before="0" w:after="120" w:lineRule="auto" w:line="360"/>
+        <w:ind w:firstLine="720"/>
+        <w:jc w:val="both"/>
+      </w:pPr>
+      <w:r>
+        <w:rPr>
+          <w:rFonts w:ascii="Arial Narrow" w:hAnsi="Arial Narrow"/>
+          <w:b w:val="0"/>
+          <w:i w:val="0"/>
+          <w:sz w:val="22"/>
+        </w:rPr>
+        <w:t>Se implementó el bloqueo explícito de solicitudes para beneficiarios con estado inactivo. La verificación ocurre en el controlador durante la búsqueda por documento (endpoint /solicitudes/buscar-persona): cuando el beneficiario existe pero está inactivo, el sistema retorna un indicador específico que distingue esta condición del caso de persona no encontrada, evitando que el panel táctil ofrezca registrar una nueva persona con ese documento. La validación opera en dos capas —controlador y servicio— aplicando defensa en profundidad: el controlador provee la respuesta inmediata al operador y el servicio garantiza la integridad de los datos ante cualquier llamada directa al endpoint.</w:t>
+      </w:r>
+    </w:p>
+    <w:p>
+      <w:pPr>
+        <w:spacing w:before="0" w:after="120" w:lineRule="auto" w:line="360"/>
+        <w:ind w:firstLine="720"/>
+        <w:jc w:val="both"/>
+      </w:pPr>
+      <w:r>
+        <w:rPr>
+          <w:rFonts w:ascii="Arial Narrow" w:hAnsi="Arial Narrow"/>
+          <w:b w:val="0"/>
+          <w:i w:val="0"/>
+          <w:sz w:val="22"/>
+        </w:rPr>
+        <w:t>La opción de cambio de contraseña fue restringida al rol administrador. Se ocultó el botón correspondiente del menú desplegable del usuario para el rol operador y se agregó verificación de rol en el controlador antes de procesar la solicitud al endpoint /perfil/password. Con este ajuste, el cambio de contraseña queda centralizado en la sección de Usuarios de la pantalla de configuración, donde el administrador puede actualizar la contraseña de cualquier cuenta sin requerir que el operador conozca su contraseña actual.</w:t>
       </w:r>
     </w:p>
     <w:p>

</xml_diff>